<commit_message>
Przebuduj checkliste punkt po punkcie z taryfikatorem
Co-authored-by: arena-agent <297053741+arena-agent@users.noreply.github.com>
</commit_message>
<xml_diff>
--- a/CHECKLISTA-TOYOTA-VERSO-SKP.docx
+++ b/CHECKLISTA-TOYOTA-VERSO-SKP.docx
@@ -4,49 +4,49 @@
   <w:body>
     <w:p>
       <w:pPr>
-        <w:spacing w:after="80"/>
+        <w:spacing w:after="60"/>
         <w:jc w:val="center"/>
       </w:pPr>
       <w:r>
         <w:rPr>
           <w:rFonts w:ascii="Arial" w:hAnsi="Arial"/>
           <w:b/>
-          <w:sz w:val="32"/>
+          <w:sz w:val="28"/>
         </w:rPr>
-        <w:t>TOYOTA VERSO — CHECKLISTA SKP I NEGOCJACJI</w:t>
+        <w:t>TOYOTA VERSO — CHECKLISTA SKP, TARYFIKATOR I PYTANIA</w:t>
       </w:r>
     </w:p>
     <w:p>
       <w:pPr>
-        <w:spacing w:after="80"/>
+        <w:spacing w:after="60"/>
         <w:jc w:val="left"/>
       </w:pPr>
       <w:r>
         <w:rPr>
           <w:rFonts w:ascii="Arial" w:hAnsi="Arial"/>
           <w:b/>
-          <w:sz w:val="18"/>
+          <w:sz w:val="17"/>
         </w:rPr>
-        <w:t>VIN: NMTDG26R10R053221    Rok: 2013    Przebieg: ok. 141 150 km    Cena: 45 000 zł</w:t>
+        <w:t>VIN NMTDG26R10R053221 | 2013 | benzyna 1.8 | przebieg ok. 141 150 km | cena ofertowa 45 000 zł</w:t>
       </w:r>
     </w:p>
     <w:p>
       <w:pPr>
-        <w:spacing w:after="80"/>
+        <w:spacing w:after="60"/>
         <w:jc w:val="left"/>
       </w:pPr>
       <w:r>
         <w:rPr>
           <w:rFonts w:ascii="Arial" w:hAnsi="Arial"/>
           <w:b w:val="0"/>
-          <w:sz w:val="18"/>
+          <w:sz w:val="17"/>
         </w:rPr>
-        <w:t>Skala: 5 — wzorowo | 4 — dobrze | 3 — obserwować | 2 — naprawa wkrótce | 1 — pilne / STOP</w:t>
+        <w:t>Ocena: 5 = bardzo dobrze | 4 = dobrze | 3 = obserwować | 2 = naprawa wkrótce | 1 = pilne / rezygnacja</w:t>
       </w:r>
     </w:p>
     <w:p>
       <w:pPr>
-        <w:spacing w:after="80"/>
+        <w:spacing w:after="60"/>
         <w:jc w:val="left"/>
       </w:pPr>
       <w:r>
@@ -55,7 +55,7 @@
           <w:b/>
           <w:sz w:val="22"/>
         </w:rPr>
-        <w:t>KONTROLA NA PODNOŚNIKU I OGLĘDZINY</w:t>
+        <w:t>1. GŁÓWNA TABELA KONTROLI — WPISUJ OCENĘ I UWAGI</w:t>
       </w:r>
     </w:p>
     <w:tbl>
@@ -66,119 +66,1184 @@
         <w:tblLook w:firstColumn="1" w:firstRow="1" w:lastColumn="0" w:lastRow="0" w:noHBand="0" w:noVBand="1" w:val="04A0"/>
       </w:tblPr>
       <w:tblGrid>
-        <w:gridCol w:w="5326"/>
-        <w:gridCol w:w="5326"/>
+        <w:gridCol w:w="3627"/>
+        <w:gridCol w:w="3627"/>
+        <w:gridCol w:w="3627"/>
       </w:tblGrid>
       <w:tr>
         <w:tc>
           <w:tcPr>
-            <w:tcW w:type="dxa" w:w="5329"/>
+            <w:tcW w:type="dxa" w:w="3118"/>
             <w:vAlign w:val="top"/>
           </w:tcPr>
           <w:p>
             <w:pPr>
-              <w:spacing w:after="40"/>
+              <w:spacing w:after="20"/>
+            </w:pPr>
+            <w:r/>
+            <w:r>
+              <w:rPr>
+                <w:rFonts w:ascii="Arial" w:hAnsi="Arial"/>
+                <w:b/>
+                <w:sz w:val="14"/>
+              </w:rPr>
+              <w:t>CO JEST DO SPRAWDZENIA</w:t>
+            </w:r>
+          </w:p>
+        </w:tc>
+        <w:tc>
+          <w:tcPr>
+            <w:tcW w:type="dxa" w:w="1020"/>
+            <w:vAlign w:val="top"/>
+          </w:tcPr>
+          <w:p>
+            <w:pPr>
+              <w:spacing w:after="20"/>
+            </w:pPr>
+            <w:r/>
+            <w:r>
+              <w:rPr>
+                <w:rFonts w:ascii="Arial" w:hAnsi="Arial"/>
+                <w:b/>
+                <w:sz w:val="14"/>
+              </w:rPr>
+              <w:t>OCENA 1–5</w:t>
+            </w:r>
+          </w:p>
+        </w:tc>
+        <w:tc>
+          <w:tcPr>
+            <w:tcW w:type="dxa" w:w="6293"/>
+            <w:vAlign w:val="top"/>
+          </w:tcPr>
+          <w:p>
+            <w:pPr>
+              <w:spacing w:after="20"/>
+            </w:pPr>
+            <w:r/>
+            <w:r>
+              <w:rPr>
+                <w:rFonts w:ascii="Arial" w:hAnsi="Arial"/>
+                <w:b/>
+                <w:sz w:val="14"/>
+              </w:rPr>
+              <w:t>UWAGI / WYNIK / PILNOŚĆ</w:t>
+            </w:r>
+          </w:p>
+        </w:tc>
+      </w:tr>
+      <w:tr>
+        <w:tc>
+          <w:tcPr>
+            <w:tcW w:type="dxa" w:w="3118"/>
+            <w:vAlign w:val="top"/>
+          </w:tcPr>
+          <w:p>
+            <w:pPr>
+              <w:spacing w:after="20"/>
             </w:pPr>
             <w:r/>
             <w:r>
               <w:rPr>
                 <w:rFonts w:ascii="Arial" w:hAnsi="Arial"/>
                 <w:b w:val="0"/>
-                <w:sz w:val="17"/>
+                <w:sz w:val="14"/>
               </w:rPr>
-              <w:t>OBSZAR                         CO SPRAWDZIĆ                                      OCENA</w:t>
-              <w:br/>
               <w:t>Korozja konstrukcyjna</w:t>
-              <w:br/>
-              <w:t>progi, podłużnice, sanki, mocowania; osłabienie = STOP     OCENA: ______</w:t>
-              <w:br/>
-              <w:t>Podwozie / korozja</w:t>
-              <w:br/>
-              <w:t>inne skorodowane miejsca po wymianie przewodów?     OCENA: ______</w:t>
-              <w:br/>
-              <w:t>Przewody hamulcowe</w:t>
-              <w:br/>
-              <w:t>szczelność i jakość naprawy z 08.2026     OCENA: ______</w:t>
-              <w:br/>
-              <w:t>Przewody paliwa</w:t>
-              <w:br/>
-              <w:t>zapach benzyny, wyciek, mocowania     OCENA: ______</w:t>
-              <w:br/>
-              <w:t>Hamulce</w:t>
-              <w:br/>
-              <w:t>rolki, różnica stron, ręczny, zaciski     OCENA: ______</w:t>
-              <w:br/>
-              <w:t>Zawieszenie</w:t>
-              <w:br/>
-              <w:t>amortyzatory, tuleje, wahacze, luzy     OCENA: ______</w:t>
-              <w:br/>
-              <w:t>Kierowniczy / łożyska</w:t>
-              <w:br/>
-              <w:t>ściąganie, drążki, końcówki, szum     OCENA: ______</w:t>
-              <w:br/>
-              <w:t>Przeguby / półosie</w:t>
-              <w:br/>
-              <w:t>osłona z 06.2024; cykanie, smar, drgania     OCENA: ______</w:t>
-              <w:br/>
-              <w:t>Wydech</w:t>
-              <w:br/>
-              <w:t>mocowanie z 08.2026, korozja     OCENA: ______</w:t>
             </w:r>
           </w:p>
         </w:tc>
         <w:tc>
           <w:tcPr>
-            <w:tcW w:type="dxa" w:w="5329"/>
+            <w:tcW w:type="dxa" w:w="1020"/>
             <w:vAlign w:val="top"/>
           </w:tcPr>
           <w:p>
             <w:pPr>
-              <w:spacing w:after="40"/>
+              <w:spacing w:after="20"/>
             </w:pPr>
             <w:r/>
             <w:r>
               <w:rPr>
                 <w:rFonts w:ascii="Arial" w:hAnsi="Arial"/>
                 <w:b w:val="0"/>
-                <w:sz w:val="17"/>
+                <w:sz w:val="14"/>
               </w:rPr>
-              <w:t>OBSZAR                         CO SPRAWDZIĆ                                      OCENA</w:t>
-              <w:br/>
+              <w:t>____</w:t>
+            </w:r>
+          </w:p>
+        </w:tc>
+        <w:tc>
+          <w:tcPr>
+            <w:tcW w:type="dxa" w:w="6293"/>
+            <w:vAlign w:val="top"/>
+          </w:tcPr>
+          <w:p>
+            <w:pPr>
+              <w:spacing w:after="20"/>
+            </w:pPr>
+            <w:r/>
+            <w:r>
+              <w:rPr>
+                <w:rFonts w:ascii="Arial" w:hAnsi="Arial"/>
+                <w:b w:val="0"/>
+                <w:sz w:val="14"/>
+              </w:rPr>
+              <w:t>________________________________________________________________</w:t>
+            </w:r>
+          </w:p>
+        </w:tc>
+      </w:tr>
+      <w:tr>
+        <w:tc>
+          <w:tcPr>
+            <w:tcW w:type="dxa" w:w="3118"/>
+            <w:vAlign w:val="top"/>
+          </w:tcPr>
+          <w:p>
+            <w:pPr>
+              <w:spacing w:after="20"/>
+            </w:pPr>
+            <w:r/>
+            <w:r>
+              <w:rPr>
+                <w:rFonts w:ascii="Arial" w:hAnsi="Arial"/>
+                <w:b w:val="0"/>
+                <w:sz w:val="14"/>
+              </w:rPr>
+              <w:t>Korozja podwozia</w:t>
+            </w:r>
+          </w:p>
+        </w:tc>
+        <w:tc>
+          <w:tcPr>
+            <w:tcW w:type="dxa" w:w="1020"/>
+            <w:vAlign w:val="top"/>
+          </w:tcPr>
+          <w:p>
+            <w:pPr>
+              <w:spacing w:after="20"/>
+            </w:pPr>
+            <w:r/>
+            <w:r>
+              <w:rPr>
+                <w:rFonts w:ascii="Arial" w:hAnsi="Arial"/>
+                <w:b w:val="0"/>
+                <w:sz w:val="14"/>
+              </w:rPr>
+              <w:t>____</w:t>
+            </w:r>
+          </w:p>
+        </w:tc>
+        <w:tc>
+          <w:tcPr>
+            <w:tcW w:type="dxa" w:w="6293"/>
+            <w:vAlign w:val="top"/>
+          </w:tcPr>
+          <w:p>
+            <w:pPr>
+              <w:spacing w:after="20"/>
+            </w:pPr>
+            <w:r/>
+            <w:r>
+              <w:rPr>
+                <w:rFonts w:ascii="Arial" w:hAnsi="Arial"/>
+                <w:b w:val="0"/>
+                <w:sz w:val="14"/>
+              </w:rPr>
+              <w:t>________________________________________________________________</w:t>
+            </w:r>
+          </w:p>
+        </w:tc>
+      </w:tr>
+      <w:tr>
+        <w:tc>
+          <w:tcPr>
+            <w:tcW w:type="dxa" w:w="3118"/>
+            <w:vAlign w:val="top"/>
+          </w:tcPr>
+          <w:p>
+            <w:pPr>
+              <w:spacing w:after="20"/>
+            </w:pPr>
+            <w:r/>
+            <w:r>
+              <w:rPr>
+                <w:rFonts w:ascii="Arial" w:hAnsi="Arial"/>
+                <w:b w:val="0"/>
+                <w:sz w:val="14"/>
+              </w:rPr>
+              <w:t>Przewody hamulcowe</w:t>
+            </w:r>
+          </w:p>
+        </w:tc>
+        <w:tc>
+          <w:tcPr>
+            <w:tcW w:type="dxa" w:w="1020"/>
+            <w:vAlign w:val="top"/>
+          </w:tcPr>
+          <w:p>
+            <w:pPr>
+              <w:spacing w:after="20"/>
+            </w:pPr>
+            <w:r/>
+            <w:r>
+              <w:rPr>
+                <w:rFonts w:ascii="Arial" w:hAnsi="Arial"/>
+                <w:b w:val="0"/>
+                <w:sz w:val="14"/>
+              </w:rPr>
+              <w:t>____</w:t>
+            </w:r>
+          </w:p>
+        </w:tc>
+        <w:tc>
+          <w:tcPr>
+            <w:tcW w:type="dxa" w:w="6293"/>
+            <w:vAlign w:val="top"/>
+          </w:tcPr>
+          <w:p>
+            <w:pPr>
+              <w:spacing w:after="20"/>
+            </w:pPr>
+            <w:r/>
+            <w:r>
+              <w:rPr>
+                <w:rFonts w:ascii="Arial" w:hAnsi="Arial"/>
+                <w:b w:val="0"/>
+                <w:sz w:val="14"/>
+              </w:rPr>
+              <w:t>________________________________________________________________</w:t>
+            </w:r>
+          </w:p>
+        </w:tc>
+      </w:tr>
+      <w:tr>
+        <w:tc>
+          <w:tcPr>
+            <w:tcW w:type="dxa" w:w="3118"/>
+            <w:vAlign w:val="top"/>
+          </w:tcPr>
+          <w:p>
+            <w:pPr>
+              <w:spacing w:after="20"/>
+            </w:pPr>
+            <w:r/>
+            <w:r>
+              <w:rPr>
+                <w:rFonts w:ascii="Arial" w:hAnsi="Arial"/>
+                <w:b w:val="0"/>
+                <w:sz w:val="14"/>
+              </w:rPr>
+              <w:t>Przewody paliwowe</w:t>
+            </w:r>
+          </w:p>
+        </w:tc>
+        <w:tc>
+          <w:tcPr>
+            <w:tcW w:type="dxa" w:w="1020"/>
+            <w:vAlign w:val="top"/>
+          </w:tcPr>
+          <w:p>
+            <w:pPr>
+              <w:spacing w:after="20"/>
+            </w:pPr>
+            <w:r/>
+            <w:r>
+              <w:rPr>
+                <w:rFonts w:ascii="Arial" w:hAnsi="Arial"/>
+                <w:b w:val="0"/>
+                <w:sz w:val="14"/>
+              </w:rPr>
+              <w:t>____</w:t>
+            </w:r>
+          </w:p>
+        </w:tc>
+        <w:tc>
+          <w:tcPr>
+            <w:tcW w:type="dxa" w:w="6293"/>
+            <w:vAlign w:val="top"/>
+          </w:tcPr>
+          <w:p>
+            <w:pPr>
+              <w:spacing w:after="20"/>
+            </w:pPr>
+            <w:r/>
+            <w:r>
+              <w:rPr>
+                <w:rFonts w:ascii="Arial" w:hAnsi="Arial"/>
+                <w:b w:val="0"/>
+                <w:sz w:val="14"/>
+              </w:rPr>
+              <w:t>________________________________________________________________</w:t>
+            </w:r>
+          </w:p>
+        </w:tc>
+      </w:tr>
+      <w:tr>
+        <w:tc>
+          <w:tcPr>
+            <w:tcW w:type="dxa" w:w="3118"/>
+            <w:vAlign w:val="top"/>
+          </w:tcPr>
+          <w:p>
+            <w:pPr>
+              <w:spacing w:after="20"/>
+            </w:pPr>
+            <w:r/>
+            <w:r>
+              <w:rPr>
+                <w:rFonts w:ascii="Arial" w:hAnsi="Arial"/>
+                <w:b w:val="0"/>
+                <w:sz w:val="14"/>
+              </w:rPr>
+              <w:t>Hamulce</w:t>
+            </w:r>
+          </w:p>
+        </w:tc>
+        <w:tc>
+          <w:tcPr>
+            <w:tcW w:type="dxa" w:w="1020"/>
+            <w:vAlign w:val="top"/>
+          </w:tcPr>
+          <w:p>
+            <w:pPr>
+              <w:spacing w:after="20"/>
+            </w:pPr>
+            <w:r/>
+            <w:r>
+              <w:rPr>
+                <w:rFonts w:ascii="Arial" w:hAnsi="Arial"/>
+                <w:b w:val="0"/>
+                <w:sz w:val="14"/>
+              </w:rPr>
+              <w:t>____</w:t>
+            </w:r>
+          </w:p>
+        </w:tc>
+        <w:tc>
+          <w:tcPr>
+            <w:tcW w:type="dxa" w:w="6293"/>
+            <w:vAlign w:val="top"/>
+          </w:tcPr>
+          <w:p>
+            <w:pPr>
+              <w:spacing w:after="20"/>
+            </w:pPr>
+            <w:r/>
+            <w:r>
+              <w:rPr>
+                <w:rFonts w:ascii="Arial" w:hAnsi="Arial"/>
+                <w:b w:val="0"/>
+                <w:sz w:val="14"/>
+              </w:rPr>
+              <w:t>________________________________________________________________</w:t>
+            </w:r>
+          </w:p>
+        </w:tc>
+      </w:tr>
+      <w:tr>
+        <w:tc>
+          <w:tcPr>
+            <w:tcW w:type="dxa" w:w="3118"/>
+            <w:vAlign w:val="top"/>
+          </w:tcPr>
+          <w:p>
+            <w:pPr>
+              <w:spacing w:after="20"/>
+            </w:pPr>
+            <w:r/>
+            <w:r>
+              <w:rPr>
+                <w:rFonts w:ascii="Arial" w:hAnsi="Arial"/>
+                <w:b w:val="0"/>
+                <w:sz w:val="14"/>
+              </w:rPr>
+              <w:t>Zawieszenie</w:t>
+            </w:r>
+          </w:p>
+        </w:tc>
+        <w:tc>
+          <w:tcPr>
+            <w:tcW w:type="dxa" w:w="1020"/>
+            <w:vAlign w:val="top"/>
+          </w:tcPr>
+          <w:p>
+            <w:pPr>
+              <w:spacing w:after="20"/>
+            </w:pPr>
+            <w:r/>
+            <w:r>
+              <w:rPr>
+                <w:rFonts w:ascii="Arial" w:hAnsi="Arial"/>
+                <w:b w:val="0"/>
+                <w:sz w:val="14"/>
+              </w:rPr>
+              <w:t>____</w:t>
+            </w:r>
+          </w:p>
+        </w:tc>
+        <w:tc>
+          <w:tcPr>
+            <w:tcW w:type="dxa" w:w="6293"/>
+            <w:vAlign w:val="top"/>
+          </w:tcPr>
+          <w:p>
+            <w:pPr>
+              <w:spacing w:after="20"/>
+            </w:pPr>
+            <w:r/>
+            <w:r>
+              <w:rPr>
+                <w:rFonts w:ascii="Arial" w:hAnsi="Arial"/>
+                <w:b w:val="0"/>
+                <w:sz w:val="14"/>
+              </w:rPr>
+              <w:t>________________________________________________________________</w:t>
+            </w:r>
+          </w:p>
+        </w:tc>
+      </w:tr>
+      <w:tr>
+        <w:tc>
+          <w:tcPr>
+            <w:tcW w:type="dxa" w:w="3118"/>
+            <w:vAlign w:val="top"/>
+          </w:tcPr>
+          <w:p>
+            <w:pPr>
+              <w:spacing w:after="20"/>
+            </w:pPr>
+            <w:r/>
+            <w:r>
+              <w:rPr>
+                <w:rFonts w:ascii="Arial" w:hAnsi="Arial"/>
+                <w:b w:val="0"/>
+                <w:sz w:val="14"/>
+              </w:rPr>
+              <w:t>Kierowniczy / łożyska</w:t>
+            </w:r>
+          </w:p>
+        </w:tc>
+        <w:tc>
+          <w:tcPr>
+            <w:tcW w:type="dxa" w:w="1020"/>
+            <w:vAlign w:val="top"/>
+          </w:tcPr>
+          <w:p>
+            <w:pPr>
+              <w:spacing w:after="20"/>
+            </w:pPr>
+            <w:r/>
+            <w:r>
+              <w:rPr>
+                <w:rFonts w:ascii="Arial" w:hAnsi="Arial"/>
+                <w:b w:val="0"/>
+                <w:sz w:val="14"/>
+              </w:rPr>
+              <w:t>____</w:t>
+            </w:r>
+          </w:p>
+        </w:tc>
+        <w:tc>
+          <w:tcPr>
+            <w:tcW w:type="dxa" w:w="6293"/>
+            <w:vAlign w:val="top"/>
+          </w:tcPr>
+          <w:p>
+            <w:pPr>
+              <w:spacing w:after="20"/>
+            </w:pPr>
+            <w:r/>
+            <w:r>
+              <w:rPr>
+                <w:rFonts w:ascii="Arial" w:hAnsi="Arial"/>
+                <w:b w:val="0"/>
+                <w:sz w:val="14"/>
+              </w:rPr>
+              <w:t>________________________________________________________________</w:t>
+            </w:r>
+          </w:p>
+        </w:tc>
+      </w:tr>
+      <w:tr>
+        <w:tc>
+          <w:tcPr>
+            <w:tcW w:type="dxa" w:w="3118"/>
+            <w:vAlign w:val="top"/>
+          </w:tcPr>
+          <w:p>
+            <w:pPr>
+              <w:spacing w:after="20"/>
+            </w:pPr>
+            <w:r/>
+            <w:r>
+              <w:rPr>
+                <w:rFonts w:ascii="Arial" w:hAnsi="Arial"/>
+                <w:b w:val="0"/>
+                <w:sz w:val="14"/>
+              </w:rPr>
+              <w:t>Przeguby / półosie</w:t>
+            </w:r>
+          </w:p>
+        </w:tc>
+        <w:tc>
+          <w:tcPr>
+            <w:tcW w:type="dxa" w:w="1020"/>
+            <w:vAlign w:val="top"/>
+          </w:tcPr>
+          <w:p>
+            <w:pPr>
+              <w:spacing w:after="20"/>
+            </w:pPr>
+            <w:r/>
+            <w:r>
+              <w:rPr>
+                <w:rFonts w:ascii="Arial" w:hAnsi="Arial"/>
+                <w:b w:val="0"/>
+                <w:sz w:val="14"/>
+              </w:rPr>
+              <w:t>____</w:t>
+            </w:r>
+          </w:p>
+        </w:tc>
+        <w:tc>
+          <w:tcPr>
+            <w:tcW w:type="dxa" w:w="6293"/>
+            <w:vAlign w:val="top"/>
+          </w:tcPr>
+          <w:p>
+            <w:pPr>
+              <w:spacing w:after="20"/>
+            </w:pPr>
+            <w:r/>
+            <w:r>
+              <w:rPr>
+                <w:rFonts w:ascii="Arial" w:hAnsi="Arial"/>
+                <w:b w:val="0"/>
+                <w:sz w:val="14"/>
+              </w:rPr>
+              <w:t>________________________________________________________________</w:t>
+            </w:r>
+          </w:p>
+        </w:tc>
+      </w:tr>
+      <w:tr>
+        <w:tc>
+          <w:tcPr>
+            <w:tcW w:type="dxa" w:w="3118"/>
+            <w:vAlign w:val="top"/>
+          </w:tcPr>
+          <w:p>
+            <w:pPr>
+              <w:spacing w:after="20"/>
+            </w:pPr>
+            <w:r/>
+            <w:r>
+              <w:rPr>
+                <w:rFonts w:ascii="Arial" w:hAnsi="Arial"/>
+                <w:b w:val="0"/>
+                <w:sz w:val="14"/>
+              </w:rPr>
+              <w:t>Wydech</w:t>
+            </w:r>
+          </w:p>
+        </w:tc>
+        <w:tc>
+          <w:tcPr>
+            <w:tcW w:type="dxa" w:w="1020"/>
+            <w:vAlign w:val="top"/>
+          </w:tcPr>
+          <w:p>
+            <w:pPr>
+              <w:spacing w:after="20"/>
+            </w:pPr>
+            <w:r/>
+            <w:r>
+              <w:rPr>
+                <w:rFonts w:ascii="Arial" w:hAnsi="Arial"/>
+                <w:b w:val="0"/>
+                <w:sz w:val="14"/>
+              </w:rPr>
+              <w:t>____</w:t>
+            </w:r>
+          </w:p>
+        </w:tc>
+        <w:tc>
+          <w:tcPr>
+            <w:tcW w:type="dxa" w:w="6293"/>
+            <w:vAlign w:val="top"/>
+          </w:tcPr>
+          <w:p>
+            <w:pPr>
+              <w:spacing w:after="20"/>
+            </w:pPr>
+            <w:r/>
+            <w:r>
+              <w:rPr>
+                <w:rFonts w:ascii="Arial" w:hAnsi="Arial"/>
+                <w:b w:val="0"/>
+                <w:sz w:val="14"/>
+              </w:rPr>
+              <w:t>________________________________________________________________</w:t>
+            </w:r>
+          </w:p>
+        </w:tc>
+      </w:tr>
+      <w:tr>
+        <w:tc>
+          <w:tcPr>
+            <w:tcW w:type="dxa" w:w="3118"/>
+            <w:vAlign w:val="top"/>
+          </w:tcPr>
+          <w:p>
+            <w:pPr>
+              <w:spacing w:after="20"/>
+            </w:pPr>
+            <w:r/>
+            <w:r>
+              <w:rPr>
+                <w:rFonts w:ascii="Arial" w:hAnsi="Arial"/>
+                <w:b w:val="0"/>
+                <w:sz w:val="14"/>
+              </w:rPr>
               <w:t>Silnik</w:t>
-              <w:br/>
-              <w:t>zimny start, dym, kontrolki, olej, praca     OCENA: ______</w:t>
-              <w:br/>
+            </w:r>
+          </w:p>
+        </w:tc>
+        <w:tc>
+          <w:tcPr>
+            <w:tcW w:type="dxa" w:w="1020"/>
+            <w:vAlign w:val="top"/>
+          </w:tcPr>
+          <w:p>
+            <w:pPr>
+              <w:spacing w:after="20"/>
+            </w:pPr>
+            <w:r/>
+            <w:r>
+              <w:rPr>
+                <w:rFonts w:ascii="Arial" w:hAnsi="Arial"/>
+                <w:b w:val="0"/>
+                <w:sz w:val="14"/>
+              </w:rPr>
+              <w:t>____</w:t>
+            </w:r>
+          </w:p>
+        </w:tc>
+        <w:tc>
+          <w:tcPr>
+            <w:tcW w:type="dxa" w:w="6293"/>
+            <w:vAlign w:val="top"/>
+          </w:tcPr>
+          <w:p>
+            <w:pPr>
+              <w:spacing w:after="20"/>
+            </w:pPr>
+            <w:r/>
+            <w:r>
+              <w:rPr>
+                <w:rFonts w:ascii="Arial" w:hAnsi="Arial"/>
+                <w:b w:val="0"/>
+                <w:sz w:val="14"/>
+              </w:rPr>
+              <w:t>________________________________________________________________</w:t>
+            </w:r>
+          </w:p>
+        </w:tc>
+      </w:tr>
+      <w:tr>
+        <w:tc>
+          <w:tcPr>
+            <w:tcW w:type="dxa" w:w="3118"/>
+            <w:vAlign w:val="top"/>
+          </w:tcPr>
+          <w:p>
+            <w:pPr>
+              <w:spacing w:after="20"/>
+            </w:pPr>
+            <w:r/>
+            <w:r>
+              <w:rPr>
+                <w:rFonts w:ascii="Arial" w:hAnsi="Arial"/>
+                <w:b w:val="0"/>
+                <w:sz w:val="14"/>
+              </w:rPr>
               <w:t>Chłodzenie / wycieki</w:t>
-              <w:br/>
-              <w:t>temperatura, płyn, olej silnik/skrzynia     OCENA: ______</w:t>
-              <w:br/>
+            </w:r>
+          </w:p>
+        </w:tc>
+        <w:tc>
+          <w:tcPr>
+            <w:tcW w:type="dxa" w:w="1020"/>
+            <w:vAlign w:val="top"/>
+          </w:tcPr>
+          <w:p>
+            <w:pPr>
+              <w:spacing w:after="20"/>
+            </w:pPr>
+            <w:r/>
+            <w:r>
+              <w:rPr>
+                <w:rFonts w:ascii="Arial" w:hAnsi="Arial"/>
+                <w:b w:val="0"/>
+                <w:sz w:val="14"/>
+              </w:rPr>
+              <w:t>____</w:t>
+            </w:r>
+          </w:p>
+        </w:tc>
+        <w:tc>
+          <w:tcPr>
+            <w:tcW w:type="dxa" w:w="6293"/>
+            <w:vAlign w:val="top"/>
+          </w:tcPr>
+          <w:p>
+            <w:pPr>
+              <w:spacing w:after="20"/>
+            </w:pPr>
+            <w:r/>
+            <w:r>
+              <w:rPr>
+                <w:rFonts w:ascii="Arial" w:hAnsi="Arial"/>
+                <w:b w:val="0"/>
+                <w:sz w:val="14"/>
+              </w:rPr>
+              <w:t>________________________________________________________________</w:t>
+            </w:r>
+          </w:p>
+        </w:tc>
+      </w:tr>
+      <w:tr>
+        <w:tc>
+          <w:tcPr>
+            <w:tcW w:type="dxa" w:w="3118"/>
+            <w:vAlign w:val="top"/>
+          </w:tcPr>
+          <w:p>
+            <w:pPr>
+              <w:spacing w:after="20"/>
+            </w:pPr>
+            <w:r/>
+            <w:r>
+              <w:rPr>
+                <w:rFonts w:ascii="Arial" w:hAnsi="Arial"/>
+                <w:b w:val="0"/>
+                <w:sz w:val="14"/>
+              </w:rPr>
               <w:t>Sprzęgło</w:t>
-              <w:br/>
-              <w:t>ślizganie na 5. biegu, drgania, łożysko     OCENA: ______</w:t>
-              <w:br/>
+            </w:r>
+          </w:p>
+        </w:tc>
+        <w:tc>
+          <w:tcPr>
+            <w:tcW w:type="dxa" w:w="1020"/>
+            <w:vAlign w:val="top"/>
+          </w:tcPr>
+          <w:p>
+            <w:pPr>
+              <w:spacing w:after="20"/>
+            </w:pPr>
+            <w:r/>
+            <w:r>
+              <w:rPr>
+                <w:rFonts w:ascii="Arial" w:hAnsi="Arial"/>
+                <w:b w:val="0"/>
+                <w:sz w:val="14"/>
+              </w:rPr>
+              <w:t>____</w:t>
+            </w:r>
+          </w:p>
+        </w:tc>
+        <w:tc>
+          <w:tcPr>
+            <w:tcW w:type="dxa" w:w="6293"/>
+            <w:vAlign w:val="top"/>
+          </w:tcPr>
+          <w:p>
+            <w:pPr>
+              <w:spacing w:after="20"/>
+            </w:pPr>
+            <w:r/>
+            <w:r>
+              <w:rPr>
+                <w:rFonts w:ascii="Arial" w:hAnsi="Arial"/>
+                <w:b w:val="0"/>
+                <w:sz w:val="14"/>
+              </w:rPr>
+              <w:t>________________________________________________________________</w:t>
+            </w:r>
+          </w:p>
+        </w:tc>
+      </w:tr>
+      <w:tr>
+        <w:tc>
+          <w:tcPr>
+            <w:tcW w:type="dxa" w:w="3118"/>
+            <w:vAlign w:val="top"/>
+          </w:tcPr>
+          <w:p>
+            <w:pPr>
+              <w:spacing w:after="20"/>
+            </w:pPr>
+            <w:r/>
+            <w:r>
+              <w:rPr>
+                <w:rFonts w:ascii="Arial" w:hAnsi="Arial"/>
+                <w:b w:val="0"/>
+                <w:sz w:val="14"/>
+              </w:rPr>
               <w:t>Skrzynia manualna</w:t>
-              <w:br/>
-              <w:t>biegi zimno/ciepło, hałas, olej     OCENA: ______</w:t>
-              <w:br/>
+            </w:r>
+          </w:p>
+        </w:tc>
+        <w:tc>
+          <w:tcPr>
+            <w:tcW w:type="dxa" w:w="1020"/>
+            <w:vAlign w:val="top"/>
+          </w:tcPr>
+          <w:p>
+            <w:pPr>
+              <w:spacing w:after="20"/>
+            </w:pPr>
+            <w:r/>
+            <w:r>
+              <w:rPr>
+                <w:rFonts w:ascii="Arial" w:hAnsi="Arial"/>
+                <w:b w:val="0"/>
+                <w:sz w:val="14"/>
+              </w:rPr>
+              <w:t>____</w:t>
+            </w:r>
+          </w:p>
+        </w:tc>
+        <w:tc>
+          <w:tcPr>
+            <w:tcW w:type="dxa" w:w="6293"/>
+            <w:vAlign w:val="top"/>
+          </w:tcPr>
+          <w:p>
+            <w:pPr>
+              <w:spacing w:after="20"/>
+            </w:pPr>
+            <w:r/>
+            <w:r>
+              <w:rPr>
+                <w:rFonts w:ascii="Arial" w:hAnsi="Arial"/>
+                <w:b w:val="0"/>
+                <w:sz w:val="14"/>
+              </w:rPr>
+              <w:t>________________________________________________________________</w:t>
+            </w:r>
+          </w:p>
+        </w:tc>
+      </w:tr>
+      <w:tr>
+        <w:tc>
+          <w:tcPr>
+            <w:tcW w:type="dxa" w:w="3118"/>
+            <w:vAlign w:val="top"/>
+          </w:tcPr>
+          <w:p>
+            <w:pPr>
+              <w:spacing w:after="20"/>
+            </w:pPr>
+            <w:r/>
+            <w:r>
+              <w:rPr>
+                <w:rFonts w:ascii="Arial" w:hAnsi="Arial"/>
+                <w:b w:val="0"/>
+                <w:sz w:val="14"/>
+              </w:rPr>
               <w:t>Dach panoramiczny</w:t>
-              <w:br/>
-              <w:t>otwieranie, roleta, odpływy, wilgoć     OCENA: ______</w:t>
-              <w:br/>
-              <w:t>Klima / elektronika</w:t>
-              <w:br/>
-              <w:t>chłodzenie, kamera, czujniki, szyby, radio     OCENA: ______</w:t>
-              <w:br/>
+            </w:r>
+          </w:p>
+        </w:tc>
+        <w:tc>
+          <w:tcPr>
+            <w:tcW w:type="dxa" w:w="1020"/>
+            <w:vAlign w:val="top"/>
+          </w:tcPr>
+          <w:p>
+            <w:pPr>
+              <w:spacing w:after="20"/>
+            </w:pPr>
+            <w:r/>
+            <w:r>
+              <w:rPr>
+                <w:rFonts w:ascii="Arial" w:hAnsi="Arial"/>
+                <w:b w:val="0"/>
+                <w:sz w:val="14"/>
+              </w:rPr>
+              <w:t>____</w:t>
+            </w:r>
+          </w:p>
+        </w:tc>
+        <w:tc>
+          <w:tcPr>
+            <w:tcW w:type="dxa" w:w="6293"/>
+            <w:vAlign w:val="top"/>
+          </w:tcPr>
+          <w:p>
+            <w:pPr>
+              <w:spacing w:after="20"/>
+            </w:pPr>
+            <w:r/>
+            <w:r>
+              <w:rPr>
+                <w:rFonts w:ascii="Arial" w:hAnsi="Arial"/>
+                <w:b w:val="0"/>
+                <w:sz w:val="14"/>
+              </w:rPr>
+              <w:t>________________________________________________________________</w:t>
+            </w:r>
+          </w:p>
+        </w:tc>
+      </w:tr>
+      <w:tr>
+        <w:tc>
+          <w:tcPr>
+            <w:tcW w:type="dxa" w:w="3118"/>
+            <w:vAlign w:val="top"/>
+          </w:tcPr>
+          <w:p>
+            <w:pPr>
+              <w:spacing w:after="20"/>
+            </w:pPr>
+            <w:r/>
+            <w:r>
+              <w:rPr>
+                <w:rFonts w:ascii="Arial" w:hAnsi="Arial"/>
+                <w:b w:val="0"/>
+                <w:sz w:val="14"/>
+              </w:rPr>
+              <w:t>Klimatyzacja / elektronika</w:t>
+            </w:r>
+          </w:p>
+        </w:tc>
+        <w:tc>
+          <w:tcPr>
+            <w:tcW w:type="dxa" w:w="1020"/>
+            <w:vAlign w:val="top"/>
+          </w:tcPr>
+          <w:p>
+            <w:pPr>
+              <w:spacing w:after="20"/>
+            </w:pPr>
+            <w:r/>
+            <w:r>
+              <w:rPr>
+                <w:rFonts w:ascii="Arial" w:hAnsi="Arial"/>
+                <w:b w:val="0"/>
+                <w:sz w:val="14"/>
+              </w:rPr>
+              <w:t>____</w:t>
+            </w:r>
+          </w:p>
+        </w:tc>
+        <w:tc>
+          <w:tcPr>
+            <w:tcW w:type="dxa" w:w="6293"/>
+            <w:vAlign w:val="top"/>
+          </w:tcPr>
+          <w:p>
+            <w:pPr>
+              <w:spacing w:after="20"/>
+            </w:pPr>
+            <w:r/>
+            <w:r>
+              <w:rPr>
+                <w:rFonts w:ascii="Arial" w:hAnsi="Arial"/>
+                <w:b w:val="0"/>
+                <w:sz w:val="14"/>
+              </w:rPr>
+              <w:t>________________________________________________________________</w:t>
+            </w:r>
+          </w:p>
+        </w:tc>
+      </w:tr>
+      <w:tr>
+        <w:tc>
+          <w:tcPr>
+            <w:tcW w:type="dxa" w:w="3118"/>
+            <w:vAlign w:val="top"/>
+          </w:tcPr>
+          <w:p>
+            <w:pPr>
+              <w:spacing w:after="20"/>
+            </w:pPr>
+            <w:r/>
+            <w:r>
+              <w:rPr>
+                <w:rFonts w:ascii="Arial" w:hAnsi="Arial"/>
+                <w:b w:val="0"/>
+                <w:sz w:val="14"/>
+              </w:rPr>
               <w:t>Opony / koła</w:t>
-              <w:br/>
-              <w:t>DOT, bieżnik, równość; Uniroyal 2024 + drugi     OCENA: ______</w:t>
-              <w:br/>
+            </w:r>
+          </w:p>
+        </w:tc>
+        <w:tc>
+          <w:tcPr>
+            <w:tcW w:type="dxa" w:w="1020"/>
+            <w:vAlign w:val="top"/>
+          </w:tcPr>
+          <w:p>
+            <w:pPr>
+              <w:spacing w:after="20"/>
+            </w:pPr>
+            <w:r/>
+            <w:r>
+              <w:rPr>
+                <w:rFonts w:ascii="Arial" w:hAnsi="Arial"/>
+                <w:b w:val="0"/>
+                <w:sz w:val="14"/>
+              </w:rPr>
+              <w:t>____</w:t>
+            </w:r>
+          </w:p>
+        </w:tc>
+        <w:tc>
+          <w:tcPr>
+            <w:tcW w:type="dxa" w:w="6293"/>
+            <w:vAlign w:val="top"/>
+          </w:tcPr>
+          <w:p>
+            <w:pPr>
+              <w:spacing w:after="20"/>
+            </w:pPr>
+            <w:r/>
+            <w:r>
+              <w:rPr>
+                <w:rFonts w:ascii="Arial" w:hAnsi="Arial"/>
+                <w:b w:val="0"/>
+                <w:sz w:val="14"/>
+              </w:rPr>
+              <w:t>________________________________________________________________</w:t>
+            </w:r>
+          </w:p>
+        </w:tc>
+      </w:tr>
+      <w:tr>
+        <w:tc>
+          <w:tcPr>
+            <w:tcW w:type="dxa" w:w="3118"/>
+            <w:vAlign w:val="top"/>
+          </w:tcPr>
+          <w:p>
+            <w:pPr>
+              <w:spacing w:after="20"/>
+            </w:pPr>
+            <w:r/>
+            <w:r>
+              <w:rPr>
+                <w:rFonts w:ascii="Arial" w:hAnsi="Arial"/>
+                <w:b w:val="0"/>
+                <w:sz w:val="14"/>
+              </w:rPr>
               <w:t>Lakier / nadwozie</w:t>
-              <w:br/>
-              <w:t>pomiar, szyby, śruby, spasowanie     OCENA: ______</w:t>
-              <w:br/>
-              <w:t>Dokumenty</w:t>
-              <w:br/>
-              <w:t>VIN, właściciel, OC, badanie, ASO, CEPiK, kluczyki     OCENA: ______</w:t>
+            </w:r>
+          </w:p>
+        </w:tc>
+        <w:tc>
+          <w:tcPr>
+            <w:tcW w:type="dxa" w:w="1020"/>
+            <w:vAlign w:val="top"/>
+          </w:tcPr>
+          <w:p>
+            <w:pPr>
+              <w:spacing w:after="20"/>
+            </w:pPr>
+            <w:r/>
+            <w:r>
+              <w:rPr>
+                <w:rFonts w:ascii="Arial" w:hAnsi="Arial"/>
+                <w:b w:val="0"/>
+                <w:sz w:val="14"/>
+              </w:rPr>
+              <w:t>____</w:t>
+            </w:r>
+          </w:p>
+        </w:tc>
+        <w:tc>
+          <w:tcPr>
+            <w:tcW w:type="dxa" w:w="6293"/>
+            <w:vAlign w:val="top"/>
+          </w:tcPr>
+          <w:p>
+            <w:pPr>
+              <w:spacing w:after="20"/>
+            </w:pPr>
+            <w:r/>
+            <w:r>
+              <w:rPr>
+                <w:rFonts w:ascii="Arial" w:hAnsi="Arial"/>
+                <w:b w:val="0"/>
+                <w:sz w:val="14"/>
+              </w:rPr>
+              <w:t>________________________________________________________________</w:t>
+            </w:r>
+          </w:p>
+        </w:tc>
+      </w:tr>
+      <w:tr>
+        <w:tc>
+          <w:tcPr>
+            <w:tcW w:type="dxa" w:w="3118"/>
+            <w:vAlign w:val="top"/>
+          </w:tcPr>
+          <w:p>
+            <w:pPr>
+              <w:spacing w:after="20"/>
+            </w:pPr>
+            <w:r/>
+            <w:r>
+              <w:rPr>
+                <w:rFonts w:ascii="Arial" w:hAnsi="Arial"/>
+                <w:b w:val="0"/>
+                <w:sz w:val="14"/>
+              </w:rPr>
+              <w:t>Dokumenty i wyposażenie</w:t>
+            </w:r>
+          </w:p>
+        </w:tc>
+        <w:tc>
+          <w:tcPr>
+            <w:tcW w:type="dxa" w:w="1020"/>
+            <w:vAlign w:val="top"/>
+          </w:tcPr>
+          <w:p>
+            <w:pPr>
+              <w:spacing w:after="20"/>
+            </w:pPr>
+            <w:r/>
+            <w:r>
+              <w:rPr>
+                <w:rFonts w:ascii="Arial" w:hAnsi="Arial"/>
+                <w:b w:val="0"/>
+                <w:sz w:val="14"/>
+              </w:rPr>
+              <w:t>____</w:t>
+            </w:r>
+          </w:p>
+        </w:tc>
+        <w:tc>
+          <w:tcPr>
+            <w:tcW w:type="dxa" w:w="6293"/>
+            <w:vAlign w:val="top"/>
+          </w:tcPr>
+          <w:p>
+            <w:pPr>
+              <w:spacing w:after="20"/>
+            </w:pPr>
+            <w:r/>
+            <w:r>
+              <w:rPr>
+                <w:rFonts w:ascii="Arial" w:hAnsi="Arial"/>
+                <w:b w:val="0"/>
+                <w:sz w:val="14"/>
+              </w:rPr>
+              <w:t>________________________________________________________________</w:t>
             </w:r>
           </w:p>
         </w:tc>
@@ -186,35 +1251,16 @@
     </w:tbl>
     <w:p>
       <w:pPr>
-        <w:spacing w:after="80"/>
+        <w:spacing w:after="60"/>
         <w:jc w:val="left"/>
       </w:pPr>
       <w:r>
         <w:rPr>
           <w:rFonts w:ascii="Arial" w:hAnsi="Arial"/>
-          <w:b w:val="0"/>
-          <w:sz w:val="16"/>
+          <w:b/>
+          <w:sz w:val="22"/>
         </w:rPr>
-        <w:t>Wpisz ocenę przy każdym obszarze. Przy ocenie 1–2 poproś o przyczynę, pilność i koszt.</w:t>
-      </w:r>
-    </w:p>
-    <w:p>
-      <w:r>
-        <w:br w:type="page"/>
-      </w:r>
-    </w:p>
-    <w:p>
-      <w:pPr>
-        <w:spacing w:after="80"/>
-        <w:jc w:val="center"/>
-      </w:pPr>
-      <w:r>
-        <w:rPr>
-          <w:rFonts w:ascii="Arial" w:hAnsi="Arial"/>
-          <w:b/>
-          <w:sz w:val="32"/>
-        </w:rPr>
-        <w:t>JAZDA PRÓBNA, DOKUMENTY I NEGOCJACJA</w:t>
+        <w:t>2. TARYFIKATOR — BEZ OCENY, DO NEGOCJACJI CENY</w:t>
       </w:r>
     </w:p>
     <w:tbl>
@@ -225,111 +1271,1092 @@
         <w:tblLook w:firstColumn="1" w:firstRow="1" w:lastColumn="0" w:lastRow="0" w:noHBand="0" w:noVBand="1" w:val="04A0"/>
       </w:tblPr>
       <w:tblGrid>
-        <w:gridCol w:w="5326"/>
-        <w:gridCol w:w="5326"/>
+        <w:gridCol w:w="5440"/>
+        <w:gridCol w:w="5440"/>
       </w:tblGrid>
       <w:tr>
         <w:tc>
           <w:tcPr>
-            <w:tcW w:type="dxa" w:w="5329"/>
+            <w:tcW w:type="dxa" w:w="5216"/>
             <w:vAlign w:val="top"/>
           </w:tcPr>
           <w:p>
             <w:pPr>
-              <w:spacing w:after="40"/>
+              <w:spacing w:after="20"/>
+            </w:pPr>
+            <w:r/>
+            <w:r>
+              <w:rPr>
+                <w:rFonts w:ascii="Arial" w:hAnsi="Arial"/>
+                <w:b/>
+                <w:sz w:val="13"/>
+              </w:rPr>
+              <w:t>NAPRAWA / ORIENTACYJNY KOSZT</w:t>
+            </w:r>
+          </w:p>
+        </w:tc>
+        <w:tc>
+          <w:tcPr>
+            <w:tcW w:type="dxa" w:w="5216"/>
+            <w:vAlign w:val="top"/>
+          </w:tcPr>
+          <w:p>
+            <w:pPr>
+              <w:spacing w:after="20"/>
+            </w:pPr>
+            <w:r/>
+            <w:r>
+              <w:rPr>
+                <w:rFonts w:ascii="Arial" w:hAnsi="Arial"/>
+                <w:b/>
+                <w:sz w:val="13"/>
+              </w:rPr>
+              <w:t>NAPRAWA / ORIENTACYJNY KOSZT</w:t>
+            </w:r>
+          </w:p>
+        </w:tc>
+      </w:tr>
+      <w:tr>
+        <w:tc>
+          <w:tcPr>
+            <w:tcW w:type="dxa" w:w="5216"/>
+            <w:vAlign w:val="top"/>
+          </w:tcPr>
+          <w:p>
+            <w:pPr>
+              <w:spacing w:after="20"/>
             </w:pPr>
             <w:r/>
             <w:r>
               <w:rPr>
                 <w:rFonts w:ascii="Arial" w:hAnsi="Arial"/>
                 <w:b w:val="0"/>
-                <w:sz w:val="17"/>
+                <w:sz w:val="13"/>
               </w:rPr>
-              <w:t>JAZDA PRÓBNA / ZIMNY START</w:t>
-              <w:br/>
-              <w:t>☐ silnik zimny   ☐ odpala od razu   ☐ brak dymu</w:t>
-              <w:br/>
-              <w:t>☐ sprzęgło nie ślizga   ☐ biegi OK   ☐ brak ściągania/stuków</w:t>
-              <w:br/>
-              <w:t>☐ brak cykania przegubów   ☐ klima chłodzi   ☐ dach/roleta działają</w:t>
-              <w:br/>
-              <w:t>☐ brak zapachu paliwa/wycieków</w:t>
-              <w:br/>
-              <w:br/>
-              <w:t>UWAGI:</w:t>
-              <w:br/>
-              <w:br/>
-              <w:br/>
-              <w:br/>
-              <w:br/>
-              <w:t>DOKUMENTY I WYPOSAŻENIE</w:t>
-              <w:br/>
-              <w:t>☐ VIN zgodny   ☐ właściciel zgodny   ☐ dowód/OC/badanie</w:t>
-              <w:br/>
-              <w:t>☐ faktury ASO   ☐ CEPiK   ☐ wyjaśnione przebiegi 116 907 / 121 119 km</w:t>
-              <w:br/>
-              <w:t>☐ 2 kluczyki   ☐ drugi komplet kół</w:t>
-              <w:br/>
-              <w:br/>
-              <w:t>BRAKI / UWAGI:</w:t>
-              <w:br/>
+              <w:t>Korozja konstrukcyjna — 3 000–10 000+ zł; osłabienie = STOP</w:t>
+            </w:r>
+          </w:p>
+        </w:tc>
+        <w:tc>
+          <w:tcPr>
+            <w:tcW w:type="dxa" w:w="5216"/>
+            <w:vAlign w:val="top"/>
+          </w:tcPr>
+          <w:p>
+            <w:pPr>
+              <w:spacing w:after="20"/>
+            </w:pPr>
+            <w:r/>
+            <w:r>
+              <w:rPr>
+                <w:rFonts w:ascii="Arial" w:hAnsi="Arial"/>
+                <w:b w:val="0"/>
+                <w:sz w:val="13"/>
+              </w:rPr>
+              <w:t>Silnik / osprzęt — 1 000–10 000+ zł</w:t>
+            </w:r>
+          </w:p>
+        </w:tc>
+      </w:tr>
+      <w:tr>
+        <w:tc>
+          <w:tcPr>
+            <w:tcW w:type="dxa" w:w="5216"/>
+            <w:vAlign w:val="top"/>
+          </w:tcPr>
+          <w:p>
+            <w:pPr>
+              <w:spacing w:after="20"/>
+            </w:pPr>
+            <w:r/>
+            <w:r>
+              <w:rPr>
+                <w:rFonts w:ascii="Arial" w:hAnsi="Arial"/>
+                <w:b w:val="0"/>
+                <w:sz w:val="13"/>
+              </w:rPr>
+              <w:t>Przewody paliwowe — 1 500–4 000 zł; wyciek = STOP</w:t>
+            </w:r>
+          </w:p>
+        </w:tc>
+        <w:tc>
+          <w:tcPr>
+            <w:tcW w:type="dxa" w:w="5216"/>
+            <w:vAlign w:val="top"/>
+          </w:tcPr>
+          <w:p>
+            <w:pPr>
+              <w:spacing w:after="20"/>
+            </w:pPr>
+            <w:r/>
+            <w:r>
+              <w:rPr>
+                <w:rFonts w:ascii="Arial" w:hAnsi="Arial"/>
+                <w:b w:val="0"/>
+                <w:sz w:val="13"/>
+              </w:rPr>
+              <w:t>Wycieki / chłodzenie — 300–8 000+ zł</w:t>
+            </w:r>
+          </w:p>
+        </w:tc>
+      </w:tr>
+      <w:tr>
+        <w:tc>
+          <w:tcPr>
+            <w:tcW w:type="dxa" w:w="5216"/>
+            <w:vAlign w:val="top"/>
+          </w:tcPr>
+          <w:p>
+            <w:pPr>
+              <w:spacing w:after="20"/>
+            </w:pPr>
+            <w:r/>
+            <w:r>
+              <w:rPr>
+                <w:rFonts w:ascii="Arial" w:hAnsi="Arial"/>
+                <w:b w:val="0"/>
+                <w:sz w:val="13"/>
+              </w:rPr>
+              <w:t>Przewody hamulcowe — 500–1 500 zł</w:t>
+            </w:r>
+          </w:p>
+        </w:tc>
+        <w:tc>
+          <w:tcPr>
+            <w:tcW w:type="dxa" w:w="5216"/>
+            <w:vAlign w:val="top"/>
+          </w:tcPr>
+          <w:p>
+            <w:pPr>
+              <w:spacing w:after="20"/>
+            </w:pPr>
+            <w:r/>
+            <w:r>
+              <w:rPr>
+                <w:rFonts w:ascii="Arial" w:hAnsi="Arial"/>
+                <w:b w:val="0"/>
+                <w:sz w:val="13"/>
+              </w:rPr>
+              <w:t>Sprzęgło — 2 500–4 500 zł</w:t>
+            </w:r>
+          </w:p>
+        </w:tc>
+      </w:tr>
+      <w:tr>
+        <w:tc>
+          <w:tcPr>
+            <w:tcW w:type="dxa" w:w="5216"/>
+            <w:vAlign w:val="top"/>
+          </w:tcPr>
+          <w:p>
+            <w:pPr>
+              <w:spacing w:after="20"/>
+            </w:pPr>
+            <w:r/>
+            <w:r>
+              <w:rPr>
+                <w:rFonts w:ascii="Arial" w:hAnsi="Arial"/>
+                <w:b w:val="0"/>
+                <w:sz w:val="13"/>
+              </w:rPr>
+              <w:t>Hamulce: tarcze/klocki — 800–1 600 zł za oś</w:t>
+            </w:r>
+          </w:p>
+        </w:tc>
+        <w:tc>
+          <w:tcPr>
+            <w:tcW w:type="dxa" w:w="5216"/>
+            <w:vAlign w:val="top"/>
+          </w:tcPr>
+          <w:p>
+            <w:pPr>
+              <w:spacing w:after="20"/>
+            </w:pPr>
+            <w:r/>
+            <w:r>
+              <w:rPr>
+                <w:rFonts w:ascii="Arial" w:hAnsi="Arial"/>
+                <w:b w:val="0"/>
+                <w:sz w:val="13"/>
+              </w:rPr>
+              <w:t>Skrzynia — olej — 250–500 zł</w:t>
+            </w:r>
+          </w:p>
+        </w:tc>
+      </w:tr>
+      <w:tr>
+        <w:tc>
+          <w:tcPr>
+            <w:tcW w:type="dxa" w:w="5216"/>
+            <w:vAlign w:val="top"/>
+          </w:tcPr>
+          <w:p>
+            <w:pPr>
+              <w:spacing w:after="20"/>
+            </w:pPr>
+            <w:r/>
+            <w:r>
+              <w:rPr>
+                <w:rFonts w:ascii="Arial" w:hAnsi="Arial"/>
+                <w:b w:val="0"/>
+                <w:sz w:val="13"/>
+              </w:rPr>
+              <w:t>Zacisk / ręczny — 400–1 000 zł</w:t>
+            </w:r>
+          </w:p>
+        </w:tc>
+        <w:tc>
+          <w:tcPr>
+            <w:tcW w:type="dxa" w:w="5216"/>
+            <w:vAlign w:val="top"/>
+          </w:tcPr>
+          <w:p>
+            <w:pPr>
+              <w:spacing w:after="20"/>
+            </w:pPr>
+            <w:r/>
+            <w:r>
+              <w:rPr>
+                <w:rFonts w:ascii="Arial" w:hAnsi="Arial"/>
+                <w:b w:val="0"/>
+                <w:sz w:val="13"/>
+              </w:rPr>
+              <w:t>Dach panoramiczny — 200–5 000+ zł</w:t>
+            </w:r>
+          </w:p>
+        </w:tc>
+      </w:tr>
+      <w:tr>
+        <w:tc>
+          <w:tcPr>
+            <w:tcW w:type="dxa" w:w="5216"/>
+            <w:vAlign w:val="top"/>
+          </w:tcPr>
+          <w:p>
+            <w:pPr>
+              <w:spacing w:after="20"/>
+            </w:pPr>
+            <w:r/>
+            <w:r>
+              <w:rPr>
+                <w:rFonts w:ascii="Arial" w:hAnsi="Arial"/>
+                <w:b w:val="0"/>
+                <w:sz w:val="13"/>
+              </w:rPr>
+              <w:t>Zawieszenie — 300–2 000 zł</w:t>
+            </w:r>
+          </w:p>
+        </w:tc>
+        <w:tc>
+          <w:tcPr>
+            <w:tcW w:type="dxa" w:w="5216"/>
+            <w:vAlign w:val="top"/>
+          </w:tcPr>
+          <w:p>
+            <w:pPr>
+              <w:spacing w:after="20"/>
+            </w:pPr>
+            <w:r/>
+            <w:r>
+              <w:rPr>
+                <w:rFonts w:ascii="Arial" w:hAnsi="Arial"/>
+                <w:b w:val="0"/>
+                <w:sz w:val="13"/>
+              </w:rPr>
+              <w:t>Klimatyzacja / elektronika — 200–3 500 zł</w:t>
+            </w:r>
+          </w:p>
+        </w:tc>
+      </w:tr>
+      <w:tr>
+        <w:tc>
+          <w:tcPr>
+            <w:tcW w:type="dxa" w:w="5216"/>
+            <w:vAlign w:val="top"/>
+          </w:tcPr>
+          <w:p>
+            <w:pPr>
+              <w:spacing w:after="20"/>
+            </w:pPr>
+            <w:r/>
+            <w:r>
+              <w:rPr>
+                <w:rFonts w:ascii="Arial" w:hAnsi="Arial"/>
+                <w:b w:val="0"/>
+                <w:sz w:val="13"/>
+              </w:rPr>
+              <w:t>Łożysko / kierowniczy — 300–1 500 zł</w:t>
+            </w:r>
+          </w:p>
+        </w:tc>
+        <w:tc>
+          <w:tcPr>
+            <w:tcW w:type="dxa" w:w="5216"/>
+            <w:vAlign w:val="top"/>
+          </w:tcPr>
+          <w:p>
+            <w:pPr>
+              <w:spacing w:after="20"/>
+            </w:pPr>
+            <w:r/>
+            <w:r>
+              <w:rPr>
+                <w:rFonts w:ascii="Arial" w:hAnsi="Arial"/>
+                <w:b w:val="0"/>
+                <w:sz w:val="13"/>
+              </w:rPr>
+              <w:t>Opony / komplet — 1 500–2 500 zł</w:t>
+            </w:r>
+          </w:p>
+        </w:tc>
+      </w:tr>
+      <w:tr>
+        <w:tc>
+          <w:tcPr>
+            <w:tcW w:type="dxa" w:w="5216"/>
+            <w:vAlign w:val="top"/>
+          </w:tcPr>
+          <w:p>
+            <w:pPr>
+              <w:spacing w:after="20"/>
+            </w:pPr>
+            <w:r/>
+            <w:r>
+              <w:rPr>
+                <w:rFonts w:ascii="Arial" w:hAnsi="Arial"/>
+                <w:b w:val="0"/>
+                <w:sz w:val="13"/>
+              </w:rPr>
+              <w:t>Przegub / półoś — 500–3 000 zł</w:t>
+            </w:r>
+          </w:p>
+        </w:tc>
+        <w:tc>
+          <w:tcPr>
+            <w:tcW w:type="dxa" w:w="5216"/>
+            <w:vAlign w:val="top"/>
+          </w:tcPr>
+          <w:p>
+            <w:pPr>
+              <w:spacing w:after="20"/>
+            </w:pPr>
+            <w:r/>
+            <w:r>
+              <w:rPr>
+                <w:rFonts w:ascii="Arial" w:hAnsi="Arial"/>
+                <w:b w:val="0"/>
+                <w:sz w:val="13"/>
+              </w:rPr>
+              <w:t>Lakier / kosmetyka — 500–1 500 zł</w:t>
+            </w:r>
+          </w:p>
+        </w:tc>
+      </w:tr>
+      <w:tr>
+        <w:tc>
+          <w:tcPr>
+            <w:tcW w:type="dxa" w:w="5216"/>
+            <w:vAlign w:val="top"/>
+          </w:tcPr>
+          <w:p>
+            <w:pPr>
+              <w:spacing w:after="20"/>
+            </w:pPr>
+            <w:r/>
+            <w:r>
+              <w:rPr>
+                <w:rFonts w:ascii="Arial" w:hAnsi="Arial"/>
+                <w:b w:val="0"/>
+                <w:sz w:val="13"/>
+              </w:rPr>
+              <w:t>Wydech — 300–3 000 zł</w:t>
+            </w:r>
+          </w:p>
+        </w:tc>
+        <w:tc>
+          <w:tcPr>
+            <w:tcW w:type="dxa" w:w="5216"/>
+            <w:vAlign w:val="top"/>
+          </w:tcPr>
+          <w:p>
+            <w:pPr>
+              <w:spacing w:after="20"/>
+            </w:pPr>
+            <w:r/>
+            <w:r>
+              <w:rPr>
+                <w:rFonts w:ascii="Arial" w:hAnsi="Arial"/>
+                <w:b w:val="0"/>
+                <w:sz w:val="13"/>
+              </w:rPr>
+              <w:t>Poważna wada konstrukcyjna — rezygnacja, nie negocjować „na ślepo”</w:t>
+            </w:r>
+          </w:p>
+        </w:tc>
+      </w:tr>
+    </w:tbl>
+    <w:p>
+      <w:r>
+        <w:br w:type="page"/>
+      </w:r>
+    </w:p>
+    <w:p>
+      <w:pPr>
+        <w:spacing w:after="60"/>
+        <w:jc w:val="center"/>
+      </w:pPr>
+      <w:r>
+        <w:rPr>
+          <w:rFonts w:ascii="Arial" w:hAnsi="Arial"/>
+          <w:b/>
+          <w:sz w:val="28"/>
+        </w:rPr>
+        <w:t>3. KONTROLA PUNKT PO PUNKCIE — PRZED SKP I NA MIEJSCU</w:t>
+      </w:r>
+    </w:p>
+    <w:tbl>
+      <w:tblPr>
+        <w:tblStyle w:val="TableGrid"/>
+        <w:tblW w:type="auto" w:w="0"/>
+        <w:jc w:val="center"/>
+        <w:tblLook w:firstColumn="1" w:firstRow="1" w:lastColumn="0" w:lastRow="0" w:noHBand="0" w:noVBand="1" w:val="04A0"/>
+      </w:tblPr>
+      <w:tblGrid>
+        <w:gridCol w:w="3627"/>
+        <w:gridCol w:w="3627"/>
+        <w:gridCol w:w="3627"/>
+      </w:tblGrid>
+      <w:tr>
+        <w:tc>
+          <w:tcPr>
+            <w:tcW w:type="dxa" w:w="2154"/>
+            <w:vAlign w:val="top"/>
+          </w:tcPr>
+          <w:p>
+            <w:pPr>
+              <w:spacing w:after="20"/>
+            </w:pPr>
+            <w:r/>
+            <w:r>
+              <w:rPr>
+                <w:rFonts w:ascii="Arial" w:hAnsi="Arial"/>
+                <w:b/>
+                <w:sz w:val="16"/>
+              </w:rPr>
+              <w:t>PUNKT</w:t>
+            </w:r>
+          </w:p>
+        </w:tc>
+        <w:tc>
+          <w:tcPr>
+            <w:tcW w:type="dxa" w:w="4989"/>
+            <w:vAlign w:val="top"/>
+          </w:tcPr>
+          <w:p>
+            <w:pPr>
+              <w:spacing w:after="20"/>
+            </w:pPr>
+            <w:r/>
+            <w:r>
+              <w:rPr>
+                <w:rFonts w:ascii="Arial" w:hAnsi="Arial"/>
+                <w:b/>
+                <w:sz w:val="16"/>
+              </w:rPr>
+              <w:t>CO ZROBIĆ / O CO ZAPYTAĆ</w:t>
+            </w:r>
+          </w:p>
+        </w:tc>
+        <w:tc>
+          <w:tcPr>
+            <w:tcW w:type="dxa" w:w="3288"/>
+            <w:vAlign w:val="top"/>
+          </w:tcPr>
+          <w:p>
+            <w:pPr>
+              <w:spacing w:after="20"/>
+            </w:pPr>
+            <w:r/>
+            <w:r>
+              <w:rPr>
+                <w:rFonts w:ascii="Arial" w:hAnsi="Arial"/>
+                <w:b/>
+                <w:sz w:val="16"/>
+              </w:rPr>
+              <w:t>WYNIK / UWAGI / KOSZT</w:t>
+            </w:r>
+          </w:p>
+        </w:tc>
+      </w:tr>
+      <w:tr>
+        <w:tc>
+          <w:tcPr>
+            <w:tcW w:type="dxa" w:w="2154"/>
+            <w:vAlign w:val="top"/>
+          </w:tcPr>
+          <w:p>
+            <w:pPr>
+              <w:spacing w:after="20"/>
+            </w:pPr>
+            <w:r/>
+            <w:r>
+              <w:rPr>
+                <w:rFonts w:ascii="Arial" w:hAnsi="Arial"/>
+                <w:b w:val="0"/>
+                <w:sz w:val="16"/>
+              </w:rPr>
+              <w:t>ZIMNY ROZRUCH</w:t>
+            </w:r>
+          </w:p>
+        </w:tc>
+        <w:tc>
+          <w:tcPr>
+            <w:tcW w:type="dxa" w:w="4989"/>
+            <w:vAlign w:val="top"/>
+          </w:tcPr>
+          <w:p>
+            <w:pPr>
+              <w:spacing w:after="20"/>
+            </w:pPr>
+            <w:r/>
+            <w:r>
+              <w:rPr>
+                <w:rFonts w:ascii="Arial" w:hAnsi="Arial"/>
+                <w:b w:val="0"/>
+                <w:sz w:val="16"/>
+              </w:rPr>
+              <w:t>Poproś, aby silnik był zimny. Czy odpala od razu? Czy dymi? Czy obroty są równe? Czy świecą kontrolki?</w:t>
+            </w:r>
+          </w:p>
+        </w:tc>
+        <w:tc>
+          <w:tcPr>
+            <w:tcW w:type="dxa" w:w="3288"/>
+            <w:vAlign w:val="top"/>
+          </w:tcPr>
+          <w:p>
+            <w:pPr>
+              <w:spacing w:after="20"/>
+            </w:pPr>
+            <w:r/>
+            <w:r>
+              <w:rPr>
+                <w:rFonts w:ascii="Arial" w:hAnsi="Arial"/>
+                <w:b w:val="0"/>
+                <w:sz w:val="16"/>
+              </w:rPr>
               <w:br/>
               <w:br/>
               <w:br/>
             </w:r>
           </w:p>
         </w:tc>
+      </w:tr>
+      <w:tr>
         <w:tc>
           <w:tcPr>
-            <w:tcW w:type="dxa" w:w="5329"/>
+            <w:tcW w:type="dxa" w:w="2154"/>
             <w:vAlign w:val="top"/>
           </w:tcPr>
           <w:p>
             <w:pPr>
-              <w:spacing w:after="40"/>
+              <w:spacing w:after="20"/>
             </w:pPr>
             <w:r/>
             <w:r>
               <w:rPr>
                 <w:rFonts w:ascii="Arial" w:hAnsi="Arial"/>
                 <w:b w:val="0"/>
-                <w:sz w:val="17"/>
+                <w:sz w:val="16"/>
               </w:rPr>
-              <w:t>KOSZTY DO NEGOCJACJI</w:t>
-              <w:br/>
-              <w:t>Pilne koszty: __________________ zł</w:t>
-              <w:br/>
-              <w:t>Bufor: __________________ zł</w:t>
-              <w:br/>
-              <w:t>Oferta: __________________ zł</w:t>
-              <w:br/>
-              <w:t>Cel: 40–42 tys. zł</w:t>
-              <w:br/>
-              <w:t>45 tys. tylko bez istotnych kosztów startowych.</w:t>
-              <w:br/>
-              <w:br/>
-              <w:t>PYTANIA DO DIAGNOSTY</w:t>
-              <w:br/>
-              <w:t>Czy są wady bezpieczeństwa lub konstrukcyjne?</w:t>
-              <w:br/>
-              <w:t>Czy auto wymaga pilnego wkładu?</w:t>
-              <w:br/>
-              <w:t>Co trzeba zrobić w 3, 6 i 12 miesięcy?</w:t>
-              <w:br/>
-              <w:t>Jaki jest koszt każdej naprawy?</w:t>
-              <w:br/>
-              <w:br/>
-              <w:t>ODPOWIEDZI / KOSZTY:</w:t>
+              <w:t>OGLĘDZINY PRZED SKP</w:t>
+            </w:r>
+          </w:p>
+        </w:tc>
+        <w:tc>
+          <w:tcPr>
+            <w:tcW w:type="dxa" w:w="4989"/>
+            <w:vAlign w:val="top"/>
+          </w:tcPr>
+          <w:p>
+            <w:pPr>
+              <w:spacing w:after="20"/>
+            </w:pPr>
+            <w:r/>
+            <w:r>
+              <w:rPr>
+                <w:rFonts w:ascii="Arial" w:hAnsi="Arial"/>
+                <w:b w:val="0"/>
+                <w:sz w:val="16"/>
+              </w:rPr>
+              <w:t>Sprawdź VIN na aucie i w dokumentach, szyby, ślady napraw, wycieki, zapach paliwa, opony, dach i wyposażenie.</w:t>
+            </w:r>
+          </w:p>
+        </w:tc>
+        <w:tc>
+          <w:tcPr>
+            <w:tcW w:type="dxa" w:w="3288"/>
+            <w:vAlign w:val="top"/>
+          </w:tcPr>
+          <w:p>
+            <w:pPr>
+              <w:spacing w:after="20"/>
+            </w:pPr>
+            <w:r/>
+            <w:r>
+              <w:rPr>
+                <w:rFonts w:ascii="Arial" w:hAnsi="Arial"/>
+                <w:b w:val="0"/>
+                <w:sz w:val="16"/>
+              </w:rPr>
               <w:br/>
               <w:br/>
               <w:br/>
-              <w:br/>
-              <w:br/>
-              <w:t>NAJWAŻNIEJSZE USTERKI I UWAGI</w:t>
+            </w:r>
+          </w:p>
+        </w:tc>
+      </w:tr>
+      <w:tr>
+        <w:tc>
+          <w:tcPr>
+            <w:tcW w:type="dxa" w:w="2154"/>
+            <w:vAlign w:val="top"/>
+          </w:tcPr>
+          <w:p>
+            <w:pPr>
+              <w:spacing w:after="20"/>
+            </w:pPr>
+            <w:r/>
+            <w:r>
+              <w:rPr>
+                <w:rFonts w:ascii="Arial" w:hAnsi="Arial"/>
+                <w:b w:val="0"/>
+                <w:sz w:val="16"/>
+              </w:rPr>
+              <w:t>JAZDA PRÓBNA</w:t>
+            </w:r>
+          </w:p>
+        </w:tc>
+        <w:tc>
+          <w:tcPr>
+            <w:tcW w:type="dxa" w:w="4989"/>
+            <w:vAlign w:val="top"/>
+          </w:tcPr>
+          <w:p>
+            <w:pPr>
+              <w:spacing w:after="20"/>
+            </w:pPr>
+            <w:r/>
+            <w:r>
+              <w:rPr>
+                <w:rFonts w:ascii="Arial" w:hAnsi="Arial"/>
+                <w:b w:val="0"/>
+                <w:sz w:val="16"/>
+              </w:rPr>
+              <w:t>Sprzęgło na 5. biegu, biegi na zimno i ciepło, hamowanie, ściąganie, stuki, drgania, przeguby, klimatyzacja.</w:t>
+            </w:r>
+          </w:p>
+        </w:tc>
+        <w:tc>
+          <w:tcPr>
+            <w:tcW w:type="dxa" w:w="3288"/>
+            <w:vAlign w:val="top"/>
+          </w:tcPr>
+          <w:p>
+            <w:pPr>
+              <w:spacing w:after="20"/>
+            </w:pPr>
+            <w:r/>
+            <w:r>
+              <w:rPr>
+                <w:rFonts w:ascii="Arial" w:hAnsi="Arial"/>
+                <w:b w:val="0"/>
+                <w:sz w:val="16"/>
+              </w:rPr>
               <w:br/>
               <w:br/>
               <w:br/>
+            </w:r>
+          </w:p>
+        </w:tc>
+      </w:tr>
+      <w:tr>
+        <w:tc>
+          <w:tcPr>
+            <w:tcW w:type="dxa" w:w="2154"/>
+            <w:vAlign w:val="top"/>
+          </w:tcPr>
+          <w:p>
+            <w:pPr>
+              <w:spacing w:after="20"/>
+            </w:pPr>
+            <w:r/>
+            <w:r>
+              <w:rPr>
+                <w:rFonts w:ascii="Arial" w:hAnsi="Arial"/>
+                <w:b w:val="0"/>
+                <w:sz w:val="16"/>
+              </w:rPr>
+              <w:t>PODNOŚNIK / SKP</w:t>
+            </w:r>
+          </w:p>
+        </w:tc>
+        <w:tc>
+          <w:tcPr>
+            <w:tcW w:type="dxa" w:w="4989"/>
+            <w:vAlign w:val="top"/>
+          </w:tcPr>
+          <w:p>
+            <w:pPr>
+              <w:spacing w:after="20"/>
+            </w:pPr>
+            <w:r/>
+            <w:r>
+              <w:rPr>
+                <w:rFonts w:ascii="Arial" w:hAnsi="Arial"/>
+                <w:b w:val="0"/>
+                <w:sz w:val="16"/>
+              </w:rPr>
+              <w:t>Poproś o wskazanie każdej korozji, luzu, wycieku i elementu wymagającego wymiany. Nie wystarczy „jest dobrze”.</w:t>
+            </w:r>
+          </w:p>
+        </w:tc>
+        <w:tc>
+          <w:tcPr>
+            <w:tcW w:type="dxa" w:w="3288"/>
+            <w:vAlign w:val="top"/>
+          </w:tcPr>
+          <w:p>
+            <w:pPr>
+              <w:spacing w:after="20"/>
+            </w:pPr>
+            <w:r/>
+            <w:r>
+              <w:rPr>
+                <w:rFonts w:ascii="Arial" w:hAnsi="Arial"/>
+                <w:b w:val="0"/>
+                <w:sz w:val="16"/>
+              </w:rPr>
               <w:br/>
+              <w:br/>
+              <w:br/>
+            </w:r>
+          </w:p>
+        </w:tc>
+      </w:tr>
+      <w:tr>
+        <w:tc>
+          <w:tcPr>
+            <w:tcW w:type="dxa" w:w="2154"/>
+            <w:vAlign w:val="top"/>
+          </w:tcPr>
+          <w:p>
+            <w:pPr>
+              <w:spacing w:after="20"/>
+            </w:pPr>
+            <w:r/>
+            <w:r>
+              <w:rPr>
+                <w:rFonts w:ascii="Arial" w:hAnsi="Arial"/>
+                <w:b w:val="0"/>
+                <w:sz w:val="16"/>
+              </w:rPr>
+              <w:t>DOKUMENTACJA</w:t>
+            </w:r>
+          </w:p>
+        </w:tc>
+        <w:tc>
+          <w:tcPr>
+            <w:tcW w:type="dxa" w:w="4989"/>
+            <w:vAlign w:val="top"/>
+          </w:tcPr>
+          <w:p>
+            <w:pPr>
+              <w:spacing w:after="20"/>
+            </w:pPr>
+            <w:r/>
+            <w:r>
+              <w:rPr>
+                <w:rFonts w:ascii="Arial" w:hAnsi="Arial"/>
+                <w:b w:val="0"/>
+                <w:sz w:val="16"/>
+              </w:rPr>
+              <w:t>Dowód rejestracyjny, OC, badanie, VIN, faktury ASO, CEPiK, przebiegi 116 907 / 121 119 km, naprawy z 08.2026, 2 kluczyki, drugi komplet kół.</w:t>
+            </w:r>
+          </w:p>
+        </w:tc>
+        <w:tc>
+          <w:tcPr>
+            <w:tcW w:type="dxa" w:w="3288"/>
+            <w:vAlign w:val="top"/>
+          </w:tcPr>
+          <w:p>
+            <w:pPr>
+              <w:spacing w:after="20"/>
+            </w:pPr>
+            <w:r/>
+            <w:r>
+              <w:rPr>
+                <w:rFonts w:ascii="Arial" w:hAnsi="Arial"/>
+                <w:b w:val="0"/>
+                <w:sz w:val="16"/>
+              </w:rPr>
+              <w:br/>
+              <w:br/>
+              <w:br/>
+            </w:r>
+          </w:p>
+        </w:tc>
+      </w:tr>
+      <w:tr>
+        <w:tc>
+          <w:tcPr>
+            <w:tcW w:type="dxa" w:w="2154"/>
+            <w:vAlign w:val="top"/>
+          </w:tcPr>
+          <w:p>
+            <w:pPr>
+              <w:spacing w:after="20"/>
+            </w:pPr>
+            <w:r/>
+            <w:r>
+              <w:rPr>
+                <w:rFonts w:ascii="Arial" w:hAnsi="Arial"/>
+                <w:b w:val="0"/>
+                <w:sz w:val="16"/>
+              </w:rPr>
+              <w:t>PYTANIA DO SPRZEDAJĄCEGO</w:t>
+            </w:r>
+          </w:p>
+        </w:tc>
+        <w:tc>
+          <w:tcPr>
+            <w:tcW w:type="dxa" w:w="4989"/>
+            <w:vAlign w:val="top"/>
+          </w:tcPr>
+          <w:p>
+            <w:pPr>
+              <w:spacing w:after="20"/>
+            </w:pPr>
+            <w:r/>
+            <w:r>
+              <w:rPr>
+                <w:rFonts w:ascii="Arial" w:hAnsi="Arial"/>
+                <w:b w:val="0"/>
+                <w:sz w:val="16"/>
+              </w:rPr>
+              <w:t>Czy jest współwłaściciel? Czy auto było powypadkowe? Jakie wady zna Sprzedający? Dlaczego były naprawy przewodów i wydechu? Czy zgadza się na przelew części ceny?</w:t>
+            </w:r>
+          </w:p>
+        </w:tc>
+        <w:tc>
+          <w:tcPr>
+            <w:tcW w:type="dxa" w:w="3288"/>
+            <w:vAlign w:val="top"/>
+          </w:tcPr>
+          <w:p>
+            <w:pPr>
+              <w:spacing w:after="20"/>
+            </w:pPr>
+            <w:r/>
+            <w:r>
+              <w:rPr>
+                <w:rFonts w:ascii="Arial" w:hAnsi="Arial"/>
+                <w:b w:val="0"/>
+                <w:sz w:val="16"/>
+              </w:rPr>
+              <w:br/>
+              <w:br/>
+              <w:br/>
+            </w:r>
+          </w:p>
+        </w:tc>
+      </w:tr>
+      <w:tr>
+        <w:tc>
+          <w:tcPr>
+            <w:tcW w:type="dxa" w:w="2154"/>
+            <w:vAlign w:val="top"/>
+          </w:tcPr>
+          <w:p>
+            <w:pPr>
+              <w:spacing w:after="20"/>
+            </w:pPr>
+            <w:r/>
+            <w:r>
+              <w:rPr>
+                <w:rFonts w:ascii="Arial" w:hAnsi="Arial"/>
+                <w:b w:val="0"/>
+                <w:sz w:val="16"/>
+              </w:rPr>
+              <w:t>PŁATNOŚĆ</w:t>
+            </w:r>
+          </w:p>
+        </w:tc>
+        <w:tc>
+          <w:tcPr>
+            <w:tcW w:type="dxa" w:w="4989"/>
+            <w:vAlign w:val="top"/>
+          </w:tcPr>
+          <w:p>
+            <w:pPr>
+              <w:spacing w:after="20"/>
+            </w:pPr>
+            <w:r/>
+            <w:r>
+              <w:rPr>
+                <w:rFonts w:ascii="Arial" w:hAnsi="Arial"/>
+                <w:b w:val="0"/>
+                <w:sz w:val="16"/>
+              </w:rPr>
+              <w:t>Wpisz cenę całkowitą oraz osobno gotówkę i przelew. Zachowaj potwierdzenie przelewu. Gotówka tylko po podpisaniu umowy i sprawdzeniu auta.</w:t>
+            </w:r>
+          </w:p>
+        </w:tc>
+        <w:tc>
+          <w:tcPr>
+            <w:tcW w:type="dxa" w:w="3288"/>
+            <w:vAlign w:val="top"/>
+          </w:tcPr>
+          <w:p>
+            <w:pPr>
+              <w:spacing w:after="20"/>
+            </w:pPr>
+            <w:r/>
+            <w:r>
+              <w:rPr>
+                <w:rFonts w:ascii="Arial" w:hAnsi="Arial"/>
+                <w:b w:val="0"/>
+                <w:sz w:val="16"/>
+              </w:rPr>
+              <w:br/>
+              <w:br/>
+              <w:br/>
+            </w:r>
+          </w:p>
+        </w:tc>
+      </w:tr>
+      <w:tr>
+        <w:tc>
+          <w:tcPr>
+            <w:tcW w:type="dxa" w:w="2154"/>
+            <w:vAlign w:val="top"/>
+          </w:tcPr>
+          <w:p>
+            <w:pPr>
+              <w:spacing w:after="20"/>
+            </w:pPr>
+            <w:r/>
+            <w:r>
+              <w:rPr>
+                <w:rFonts w:ascii="Arial" w:hAnsi="Arial"/>
+                <w:b w:val="0"/>
+                <w:sz w:val="16"/>
+              </w:rPr>
+              <w:t>NEGOCJACJA</w:t>
+            </w:r>
+          </w:p>
+        </w:tc>
+        <w:tc>
+          <w:tcPr>
+            <w:tcW w:type="dxa" w:w="4989"/>
+            <w:vAlign w:val="top"/>
+          </w:tcPr>
+          <w:p>
+            <w:pPr>
+              <w:spacing w:after="20"/>
+            </w:pPr>
+            <w:r/>
+            <w:r>
+              <w:rPr>
+                <w:rFonts w:ascii="Arial" w:hAnsi="Arial"/>
+                <w:b w:val="0"/>
+                <w:sz w:val="16"/>
+              </w:rPr>
+              <w:t>Od ceny odejmij wyłącznie potwierdzone koszty. Cel 40–42 tys. zł. 45 tys. zł tylko przy bardzo dobrym stanie i dokumentacji.</w:t>
+            </w:r>
+          </w:p>
+        </w:tc>
+        <w:tc>
+          <w:tcPr>
+            <w:tcW w:type="dxa" w:w="3288"/>
+            <w:vAlign w:val="top"/>
+          </w:tcPr>
+          <w:p>
+            <w:pPr>
+              <w:spacing w:after="20"/>
+            </w:pPr>
+            <w:r/>
+            <w:r>
+              <w:rPr>
+                <w:rFonts w:ascii="Arial" w:hAnsi="Arial"/>
+                <w:b w:val="0"/>
+                <w:sz w:val="16"/>
+              </w:rPr>
+              <w:br/>
+              <w:br/>
+              <w:br/>
+            </w:r>
+          </w:p>
+        </w:tc>
+      </w:tr>
+      <w:tr>
+        <w:tc>
+          <w:tcPr>
+            <w:tcW w:type="dxa" w:w="2154"/>
+            <w:vAlign w:val="top"/>
+          </w:tcPr>
+          <w:p>
+            <w:pPr>
+              <w:spacing w:after="20"/>
+            </w:pPr>
+            <w:r/>
+            <w:r>
+              <w:rPr>
+                <w:rFonts w:ascii="Arial" w:hAnsi="Arial"/>
+                <w:b w:val="0"/>
+                <w:sz w:val="16"/>
+              </w:rPr>
+              <w:t>DECYZJA</w:t>
+            </w:r>
+          </w:p>
+        </w:tc>
+        <w:tc>
+          <w:tcPr>
+            <w:tcW w:type="dxa" w:w="4989"/>
+            <w:vAlign w:val="top"/>
+          </w:tcPr>
+          <w:p>
+            <w:pPr>
+              <w:spacing w:after="20"/>
+            </w:pPr>
+            <w:r/>
+            <w:r>
+              <w:rPr>
+                <w:rFonts w:ascii="Arial" w:hAnsi="Arial"/>
+                <w:b w:val="0"/>
+                <w:sz w:val="16"/>
+              </w:rPr>
+              <w:t>Nie kupuj pod presją. Jeśli wada bezpieczeństwa, konstrukcyjna, wyciek paliwa albo niejasny właściciel — przerwij transakcję.</w:t>
+            </w:r>
+          </w:p>
+        </w:tc>
+        <w:tc>
+          <w:tcPr>
+            <w:tcW w:type="dxa" w:w="3288"/>
+            <w:vAlign w:val="top"/>
+          </w:tcPr>
+          <w:p>
+            <w:pPr>
+              <w:spacing w:after="20"/>
+            </w:pPr>
+            <w:r/>
+            <w:r>
+              <w:rPr>
+                <w:rFonts w:ascii="Arial" w:hAnsi="Arial"/>
+                <w:b w:val="0"/>
+                <w:sz w:val="16"/>
+              </w:rPr>
               <w:br/>
               <w:br/>
               <w:br/>
@@ -340,7 +2367,7 @@
     </w:tbl>
     <w:p>
       <w:pPr>
-        <w:spacing w:after="80"/>
+        <w:spacing w:after="60"/>
         <w:jc w:val="left"/>
       </w:pPr>
       <w:r>
@@ -349,55 +2376,375 @@
           <w:b/>
           <w:sz w:val="22"/>
         </w:rPr>
-        <w:t>DECYZJA PO KONTROLI</w:t>
+        <w:t>4. PODSUMOWANIE DIAGNOSTY</w:t>
+      </w:r>
+    </w:p>
+    <w:tbl>
+      <w:tblPr>
+        <w:tblStyle w:val="TableGrid"/>
+        <w:tblW w:type="auto" w:w="0"/>
+        <w:jc w:val="center"/>
+        <w:tblLook w:firstColumn="1" w:firstRow="1" w:lastColumn="0" w:lastRow="0" w:noHBand="0" w:noVBand="1" w:val="04A0"/>
+      </w:tblPr>
+      <w:tblGrid>
+        <w:gridCol w:w="5440"/>
+        <w:gridCol w:w="5440"/>
+      </w:tblGrid>
+      <w:tr>
+        <w:tc>
+          <w:tcPr>
+            <w:tcW w:type="dxa" w:w="2381"/>
+            <w:vAlign w:val="top"/>
+          </w:tcPr>
+          <w:p>
+            <w:pPr>
+              <w:spacing w:after="20"/>
+            </w:pPr>
+            <w:r/>
+            <w:r>
+              <w:rPr>
+                <w:rFonts w:ascii="Arial" w:hAnsi="Arial"/>
+                <w:b/>
+                <w:sz w:val="16"/>
+              </w:rPr>
+              <w:t>Pilne naprawy</w:t>
+            </w:r>
+          </w:p>
+        </w:tc>
+        <w:tc>
+          <w:tcPr>
+            <w:tcW w:type="dxa" w:w="8050"/>
+            <w:vAlign w:val="top"/>
+          </w:tcPr>
+          <w:p>
+            <w:pPr>
+              <w:spacing w:after="20"/>
+            </w:pPr>
+            <w:r/>
+            <w:r>
+              <w:rPr>
+                <w:rFonts w:ascii="Arial" w:hAnsi="Arial"/>
+                <w:b/>
+                <w:sz w:val="16"/>
+              </w:rPr>
+              <w:t>________________________________________________________________________________</w:t>
+            </w:r>
+          </w:p>
+        </w:tc>
+      </w:tr>
+      <w:tr>
+        <w:tc>
+          <w:tcPr>
+            <w:tcW w:type="dxa" w:w="2381"/>
+            <w:vAlign w:val="top"/>
+          </w:tcPr>
+          <w:p>
+            <w:pPr>
+              <w:spacing w:after="20"/>
+            </w:pPr>
+            <w:r/>
+            <w:r>
+              <w:rPr>
+                <w:rFonts w:ascii="Arial" w:hAnsi="Arial"/>
+                <w:b w:val="0"/>
+                <w:sz w:val="16"/>
+              </w:rPr>
+              <w:t>Koszt pilny</w:t>
+            </w:r>
+          </w:p>
+        </w:tc>
+        <w:tc>
+          <w:tcPr>
+            <w:tcW w:type="dxa" w:w="8050"/>
+            <w:vAlign w:val="top"/>
+          </w:tcPr>
+          <w:p>
+            <w:pPr>
+              <w:spacing w:after="20"/>
+            </w:pPr>
+            <w:r/>
+            <w:r>
+              <w:rPr>
+                <w:rFonts w:ascii="Arial" w:hAnsi="Arial"/>
+                <w:b w:val="0"/>
+                <w:sz w:val="16"/>
+              </w:rPr>
+              <w:t>__________________ zł</w:t>
+            </w:r>
+          </w:p>
+        </w:tc>
+      </w:tr>
+      <w:tr>
+        <w:tc>
+          <w:tcPr>
+            <w:tcW w:type="dxa" w:w="2381"/>
+            <w:vAlign w:val="top"/>
+          </w:tcPr>
+          <w:p>
+            <w:pPr>
+              <w:spacing w:after="20"/>
+            </w:pPr>
+            <w:r/>
+            <w:r>
+              <w:rPr>
+                <w:rFonts w:ascii="Arial" w:hAnsi="Arial"/>
+                <w:b w:val="0"/>
+                <w:sz w:val="16"/>
+              </w:rPr>
+              <w:t>Koszt w 6–12 miesięcy</w:t>
+            </w:r>
+          </w:p>
+        </w:tc>
+        <w:tc>
+          <w:tcPr>
+            <w:tcW w:type="dxa" w:w="8050"/>
+            <w:vAlign w:val="top"/>
+          </w:tcPr>
+          <w:p>
+            <w:pPr>
+              <w:spacing w:after="20"/>
+            </w:pPr>
+            <w:r/>
+            <w:r>
+              <w:rPr>
+                <w:rFonts w:ascii="Arial" w:hAnsi="Arial"/>
+                <w:b w:val="0"/>
+                <w:sz w:val="16"/>
+              </w:rPr>
+              <w:t>__________________ zł</w:t>
+            </w:r>
+          </w:p>
+        </w:tc>
+      </w:tr>
+      <w:tr>
+        <w:tc>
+          <w:tcPr>
+            <w:tcW w:type="dxa" w:w="2381"/>
+            <w:vAlign w:val="top"/>
+          </w:tcPr>
+          <w:p>
+            <w:pPr>
+              <w:spacing w:after="20"/>
+            </w:pPr>
+            <w:r/>
+            <w:r>
+              <w:rPr>
+                <w:rFonts w:ascii="Arial" w:hAnsi="Arial"/>
+                <w:b w:val="0"/>
+                <w:sz w:val="16"/>
+              </w:rPr>
+              <w:t>Cena wyjściowa</w:t>
+            </w:r>
+          </w:p>
+        </w:tc>
+        <w:tc>
+          <w:tcPr>
+            <w:tcW w:type="dxa" w:w="8050"/>
+            <w:vAlign w:val="top"/>
+          </w:tcPr>
+          <w:p>
+            <w:pPr>
+              <w:spacing w:after="20"/>
+            </w:pPr>
+            <w:r/>
+            <w:r>
+              <w:rPr>
+                <w:rFonts w:ascii="Arial" w:hAnsi="Arial"/>
+                <w:b w:val="0"/>
+                <w:sz w:val="16"/>
+              </w:rPr>
+              <w:t>45 000 zł</w:t>
+            </w:r>
+          </w:p>
+        </w:tc>
+      </w:tr>
+      <w:tr>
+        <w:tc>
+          <w:tcPr>
+            <w:tcW w:type="dxa" w:w="2381"/>
+            <w:vAlign w:val="top"/>
+          </w:tcPr>
+          <w:p>
+            <w:pPr>
+              <w:spacing w:after="20"/>
+            </w:pPr>
+            <w:r/>
+            <w:r>
+              <w:rPr>
+                <w:rFonts w:ascii="Arial" w:hAnsi="Arial"/>
+                <w:b w:val="0"/>
+                <w:sz w:val="16"/>
+              </w:rPr>
+              <w:t>Oferta po kontroli</w:t>
+            </w:r>
+          </w:p>
+        </w:tc>
+        <w:tc>
+          <w:tcPr>
+            <w:tcW w:type="dxa" w:w="8050"/>
+            <w:vAlign w:val="top"/>
+          </w:tcPr>
+          <w:p>
+            <w:pPr>
+              <w:spacing w:after="20"/>
+            </w:pPr>
+            <w:r/>
+            <w:r>
+              <w:rPr>
+                <w:rFonts w:ascii="Arial" w:hAnsi="Arial"/>
+                <w:b w:val="0"/>
+                <w:sz w:val="16"/>
+              </w:rPr>
+              <w:t>__________________ zł</w:t>
+            </w:r>
+          </w:p>
+        </w:tc>
+      </w:tr>
+      <w:tr>
+        <w:tc>
+          <w:tcPr>
+            <w:tcW w:type="dxa" w:w="2381"/>
+            <w:vAlign w:val="top"/>
+          </w:tcPr>
+          <w:p>
+            <w:pPr>
+              <w:spacing w:after="20"/>
+            </w:pPr>
+            <w:r/>
+            <w:r>
+              <w:rPr>
+                <w:rFonts w:ascii="Arial" w:hAnsi="Arial"/>
+                <w:b w:val="0"/>
+                <w:sz w:val="16"/>
+              </w:rPr>
+              <w:t>Decyzja</w:t>
+            </w:r>
+          </w:p>
+        </w:tc>
+        <w:tc>
+          <w:tcPr>
+            <w:tcW w:type="dxa" w:w="8050"/>
+            <w:vAlign w:val="top"/>
+          </w:tcPr>
+          <w:p>
+            <w:pPr>
+              <w:spacing w:after="20"/>
+            </w:pPr>
+            <w:r/>
+            <w:r>
+              <w:rPr>
+                <w:rFonts w:ascii="Arial" w:hAnsi="Arial"/>
+                <w:b w:val="0"/>
+                <w:sz w:val="16"/>
+              </w:rPr>
+              <w:t>☐ kupić   ☐ negocjować   ☐ wrócić do analizy   ☐ zrezygnować</w:t>
+            </w:r>
+          </w:p>
+        </w:tc>
+      </w:tr>
+    </w:tbl>
+    <w:p>
+      <w:pPr>
+        <w:spacing w:after="60"/>
+        <w:jc w:val="left"/>
+      </w:pPr>
+      <w:r>
+        <w:rPr>
+          <w:rFonts w:ascii="Arial" w:hAnsi="Arial"/>
+          <w:b/>
+          <w:sz w:val="22"/>
+        </w:rPr>
+        <w:t>5. NAJWAŻNIEJSZE UWAGI</w:t>
       </w:r>
     </w:p>
     <w:p>
       <w:pPr>
-        <w:spacing w:after="80"/>
+        <w:spacing w:after="60"/>
         <w:jc w:val="left"/>
       </w:pPr>
       <w:r>
         <w:rPr>
           <w:rFonts w:ascii="Arial" w:hAnsi="Arial"/>
           <w:b w:val="0"/>
-          <w:sz w:val="18"/>
+          <w:sz w:val="17"/>
         </w:rPr>
-        <w:t>☐ kupić     ☐ kupić po negocjacji     ☐ wrócić do analizy     ☐ zrezygnować</w:t>
+        <w:t>________________________________________________________________________________________________________________</w:t>
       </w:r>
     </w:p>
     <w:p>
       <w:pPr>
-        <w:spacing w:after="80"/>
+        <w:spacing w:after="60"/>
         <w:jc w:val="left"/>
       </w:pPr>
       <w:r>
         <w:rPr>
           <w:rFonts w:ascii="Arial" w:hAnsi="Arial"/>
           <w:b w:val="0"/>
-          <w:sz w:val="18"/>
+          <w:sz w:val="17"/>
         </w:rPr>
-        <w:t>Cena po kontroli: __________________ zł       Diagnosta / SKP: _________________________________</w:t>
+        <w:t>________________________________________________________________________________________________________________</w:t>
       </w:r>
     </w:p>
     <w:p>
       <w:pPr>
-        <w:spacing w:after="80"/>
+        <w:spacing w:after="60"/>
+        <w:jc w:val="left"/>
+      </w:pPr>
+      <w:r>
+        <w:rPr>
+          <w:rFonts w:ascii="Arial" w:hAnsi="Arial"/>
+          <w:b w:val="0"/>
+          <w:sz w:val="17"/>
+        </w:rPr>
+        <w:t>________________________________________________________________________________________________________________</w:t>
+      </w:r>
+    </w:p>
+    <w:p>
+      <w:pPr>
+        <w:spacing w:after="60"/>
+        <w:jc w:val="left"/>
+      </w:pPr>
+      <w:r>
+        <w:rPr>
+          <w:rFonts w:ascii="Arial" w:hAnsi="Arial"/>
+          <w:b w:val="0"/>
+          <w:sz w:val="17"/>
+        </w:rPr>
+        <w:t>________________________________________________________________________________________________________________</w:t>
+      </w:r>
+    </w:p>
+    <w:p>
+      <w:pPr>
+        <w:spacing w:after="60"/>
+        <w:jc w:val="left"/>
+      </w:pPr>
+      <w:r>
+        <w:rPr>
+          <w:rFonts w:ascii="Arial" w:hAnsi="Arial"/>
+          <w:b w:val="0"/>
+          <w:sz w:val="17"/>
+        </w:rPr>
+        <w:t>________________________________________________________________________________________________________________</w:t>
+      </w:r>
+    </w:p>
+    <w:p>
+      <w:pPr>
+        <w:spacing w:after="60"/>
         <w:jc w:val="left"/>
       </w:pPr>
       <w:r>
         <w:rPr>
           <w:rFonts w:ascii="Arial" w:hAnsi="Arial"/>
           <w:b/>
-          <w:sz w:val="18"/>
+          <w:sz w:val="16"/>
         </w:rPr>
-        <w:t>Najważniejsze: nie zgadzaj się na „tak ma być” bez wskazania przyczyny, pilności i kosztu.</w:t>
+        <w:t>Najważniejsze pytanie do diagnosty: „Czy kupiłby Pan ten konkretny samochód za 40–45 tys. zł przy tym stanie i przebiegu? Jeśli nie, to dlaczego i jaki koszt Pan widzi?”</w:t>
       </w:r>
     </w:p>
     <w:sectPr>
       <w:footerReference w:type="default" r:id="rId9"/>
       <w:pgSz w:w="12240" w:h="15840"/>
-      <w:pgMar w:top="794" w:right="794" w:bottom="794" w:left="794" w:header="720" w:footer="720" w:gutter="0"/>
+      <w:pgMar w:top="680" w:right="680" w:bottom="680" w:left="680" w:header="720" w:footer="720" w:gutter="0"/>
       <w:cols w:space="720"/>
       <w:docGrid w:linePitch="360"/>
     </w:sectPr>
@@ -787,7 +3134,7 @@
     <w:rsid w:val="00FC693F"/>
     <w:rPr>
       <w:rFonts w:ascii="Arial" w:hAnsi="Arial" w:eastAsia="Arial"/>
-      <w:sz w:val="18"/>
+      <w:sz w:val="17"/>
     </w:rPr>
   </w:style>
   <w:style w:type="paragraph" w:styleId="Header">

</xml_diff>